<commit_message>
Refresh reviewed thesis figures and DOCX after evidence snapshot update
The figure data hash and DOCX content drifted from the canonical
snapshot after the artifact-chain refresh. Regenerates the four
reviewed figure assets and rebuilds the deterministic DOCX so both
match current evidence again. packageRevision rebind follows next.

Co-Authored-By: Claude <claude-sonnet-5> <noreply@anthropic.com>
</commit_message>
<xml_diff>
--- a/thesis/output/VEGO-AI-MSc-Thesis-Evidence-Ready-Draft-2026-07-25.docx
+++ b/thesis/output/VEGO-AI-MSc-Thesis-Evidence-Ready-Draft-2026-07-25.docx
@@ -82,7 +82,7 @@
         <w:br/>
         <w:t>25 July 2026</w:t>
         <w:br/>
-        <w:t>Source revision 2e0d014bd9af</w:t>
+        <w:t>Source revision aba24508d6f7</w:t>
       </w:r>
     </w:p>
     <w:p>
@@ -3594,6 +3594,96 @@
     </w:p>
     <w:p>
       <w:pPr>
+        <w:pStyle w:val="EvidenceCallout"/>
+        <w:shd w:fill="EEF5FA"/>
+        <w:pBdr>
+          <w:left w:val="single" w:sz="18" w:space="8" w:color="2E74B5"/>
+        </w:pBdr>
+      </w:pPr>
+      <w:r>
+        <w:rPr>
+          <w:b/>
+        </w:rPr>
+        <w:t>2026-08-10 migration note:</w:t>
+      </w:r>
+      <w:r>
+        <w:t xml:space="preserve"> the research question and sub-questions below were updated to the umbrella-RQ + exactly-three-subquestions structure (</w:t>
+      </w:r>
+      <w:r>
+        <w:rPr>
+          <w:rFonts w:ascii="Consolas" w:hAnsi="Consolas"/>
+          <w:color w:val="1F4D78"/>
+          <w:sz w:val="18"/>
+        </w:rPr>
+        <w:t>SQ1</w:t>
+      </w:r>
+      <w:r>
+        <w:t xml:space="preserve"> selective intervention, </w:t>
+      </w:r>
+      <w:r>
+        <w:rPr>
+          <w:rFonts w:ascii="Consolas" w:hAnsi="Consolas"/>
+          <w:color w:val="1F4D78"/>
+          <w:sz w:val="18"/>
+        </w:rPr>
+        <w:t>SQ2</w:t>
+      </w:r>
+      <w:r>
+        <w:t xml:space="preserve"> governed knowledge reuse, </w:t>
+      </w:r>
+      <w:r>
+        <w:rPr>
+          <w:rFonts w:ascii="Consolas" w:hAnsi="Consolas"/>
+          <w:color w:val="1F4D78"/>
+          <w:sz w:val="18"/>
+        </w:rPr>
+        <w:t>SQ3</w:t>
+      </w:r>
+      <w:r>
+        <w:t xml:space="preserve"> evaluation and transfer) required by the 2026-07-29 supervisor meeting and refined live in the 2026-08-05 supervisor working call. </w:t>
+      </w:r>
+      <w:r>
+        <w:rPr>
+          <w:b/>
+        </w:rPr>
+        <w:t>This wording is provisional  -  pending formal `D-RQ-01`/`D-RQ-02` sign-off</w:t>
+      </w:r>
+      <w:r>
+        <w:t xml:space="preserve"> in </w:t>
+      </w:r>
+      <w:r>
+        <w:rPr>
+          <w:color w:val="2E74B5"/>
+          <w:u w:val="single"/>
+        </w:rPr>
+        <w:t>`docs/research/phd-proposal/2026-08-05-rq-decision-pack.md` (../../docs/research/phd-proposal/2026-08-05-rq-decision-pack.md)</w:t>
+      </w:r>
+      <w:r>
+        <w:t xml:space="preserve">; see </w:t>
+      </w:r>
+      <w:r>
+        <w:rPr>
+          <w:color w:val="2E74B5"/>
+          <w:u w:val="single"/>
+        </w:rPr>
+        <w:t>`docs/research/meetings/2026-08-05-supervisor-meeting.md` (../../docs/research/meetings/2026-08-05-supervisor-meeting.md)</w:t>
+      </w:r>
+      <w:r>
+        <w:t xml:space="preserve"> for the machine-derived evidence and </w:t>
+      </w:r>
+      <w:r>
+        <w:rPr>
+          <w:color w:val="2E74B5"/>
+          <w:u w:val="single"/>
+        </w:rPr>
+        <w:t>`docs/research/phd-proposal/legacy-rq-crosswalk.md` (../../docs/research/phd-proposal/legacy-rq-crosswalk.md)</w:t>
+      </w:r>
+      <w:r>
+        <w:t xml:space="preserve"> for how the previous five thesis sub-questions (retained below in §3.3) map onto the new three.</w:t>
+      </w:r>
+    </w:p>
+    <w:p>
+      <w:pPr>
         <w:pStyle w:val="Heading2"/>
       </w:pPr>
       <w:r>
@@ -3700,15 +3790,64 @@
         <w:rPr>
           <w:b/>
         </w:rPr>
-        <w:t>RQ.</w:t>
-      </w:r>
-      <w:r>
-        <w:t xml:space="preserve"> What approaches have been proposed to support human-AI collaboration in AI-assisted domain modeling and model assessment, and how can they inform the design of reusable human-judgment mechanisms in systems such as VEGO-AI?</w:t>
-      </w:r>
-    </w:p>
-    <w:p>
-      <w:r>
-        <w:t>This is a literature-review-oriented and design-science-compatible question. It asks both about the state of the art (what has been proposed) and about design implications (how prior work informs the artifact). VEGO-AI is the motivating case and the artifact, not the sole object of the review.</w:t>
+        <w:t>U-RQ.</w:t>
+      </w:r>
+      <w:r>
+        <w:t xml:space="preserve"> How can human judgment be captured, governed, and used to support agentic-AI-driven variability exploration in guideline operationalization scenarios, enabling reliable human-AI co-reasoning?</w:t>
+      </w:r>
+    </w:p>
+    <w:p>
+      <w:r>
+        <w:rPr>
+          <w:b/>
+        </w:rPr>
+        <w:t>Status: provisional working wording</w:t>
+      </w:r>
+      <w:r>
+        <w:t xml:space="preserve">, refined live from the 2026-07-29 working baseline during the 2026-08-05 supervisor call (Iris and Arnon). It replaces "reusable ... and reused" with "used" (the reuse concept moves to SQ2 below), drops the "auditable" / "transferable" qualifiers from the headline, and names </w:t>
+      </w:r>
+      <w:r>
+        <w:rPr>
+          <w:i/>
+        </w:rPr>
+        <w:t>variability exploration</w:t>
+      </w:r>
+      <w:r>
+        <w:t xml:space="preserve"> and </w:t>
+      </w:r>
+      <w:r>
+        <w:rPr>
+          <w:i/>
+        </w:rPr>
+        <w:t>guideline operationalization</w:t>
+      </w:r>
+      <w:r>
+        <w:t xml:space="preserve"> explicitly  -  addressing Arnon's critique that the prior wording blurred the proposed Agentic-AI solution with the actual research question. It is machine-transcribed and </w:t>
+      </w:r>
+      <w:r>
+        <w:rPr>
+          <w:b/>
+        </w:rPr>
+        <w:t>not yet supervisor-confirmed</w:t>
+      </w:r>
+      <w:r>
+        <w:t xml:space="preserve"> (</w:t>
+      </w:r>
+      <w:r>
+        <w:rPr>
+          <w:rFonts w:ascii="Consolas" w:hAnsi="Consolas"/>
+          <w:color w:val="1F4D78"/>
+          <w:sz w:val="18"/>
+        </w:rPr>
+        <w:t>D-RQ-01</w:t>
+      </w:r>
+      <w:r>
+        <w:t>); the exact final text must be checked against Ali's own saved working draft from the call before it is treated as final.</w:t>
+      </w:r>
+    </w:p>
+    <w:p>
+      <w:r>
+        <w:t>This is a design-science-compatible umbrella question: it asks how a mechanism (human judgment capture and governance) can support a target activity (variability exploration in guideline operationalization) reliably. VEGO-AI is the motivating case and the artifact, not the sole object of the underlying literature review, which continues to inform the design (Chapter 2).</w:t>
       </w:r>
     </w:p>
     <w:p>
@@ -3721,18 +3860,38 @@
     </w:p>
     <w:p>
       <w:r>
-        <w:t>The research question decomposes into five sub-questions, each addressing a distinct aspect of the human-AI collaboration design space and mapped to specific thesis chapters and milestones.</w:t>
-      </w:r>
-    </w:p>
-    <w:p>
+        <w:t xml:space="preserve">The research question decomposes into </w:t>
+      </w:r>
       <w:r>
         <w:rPr>
           <w:b/>
         </w:rPr>
-        <w:t>SQ1  -  Control and timing.</w:t>
-      </w:r>
-      <w:r>
-        <w:t xml:space="preserve"> How do existing approaches distribute control and timing between human and AI (in-the-loop, on-the-loop, co-reasoning)? This question motivates the Selective Intervention Policy (M1) and its decision to escalate by exception rather than reviewing every case. It is addressed in Chapter 2 (§2.5) and Chapter 5 (§5.2).</w:t>
+        <w:t>exactly three</w:t>
+      </w:r>
+      <w:r>
+        <w:t xml:space="preserve"> sub-questions, each mapped to one primary study (see </w:t>
+      </w:r>
+      <w:r>
+        <w:rPr>
+          <w:rFonts w:ascii="Consolas" w:hAnsi="Consolas"/>
+          <w:color w:val="1F4D78"/>
+          <w:sz w:val="18"/>
+        </w:rPr>
+        <w:t>docs/research/phd-proposal/three-study-contract.md</w:t>
+      </w:r>
+      <w:r>
+        <w:t>) and to specific thesis chapters and milestones. Wording below is provisional in the same sense as §3.2 (</w:t>
+      </w:r>
+      <w:r>
+        <w:rPr>
+          <w:rFonts w:ascii="Consolas" w:hAnsi="Consolas"/>
+          <w:color w:val="1F4D78"/>
+          <w:sz w:val="18"/>
+        </w:rPr>
+        <w:t>D-RQ-02</w:t>
+      </w:r>
+      <w:r>
+        <w:t>, pending sign-off).</w:t>
       </w:r>
     </w:p>
     <w:p>
@@ -3740,10 +3899,10 @@
         <w:rPr>
           <w:b/>
         </w:rPr>
-        <w:t>SQ2  -  Direction of information.</w:t>
-      </w:r>
-      <w:r>
-        <w:t xml:space="preserve"> Does information flow AI→human (explanation), human→AI (feedback), or both? This question underpins the bidirectional design of the artifact: the AI's evidence is preserved and the human's rationale is captured, stored, and resurfaced. It is addressed in Chapter 2 (§2.6) and Chapter 5 (§5.3-§5.5).</w:t>
+        <w:t>SQ1  -  Selective intervention.</w:t>
+      </w:r>
+      <w:r>
+        <w:t xml:space="preserve"> When and how, in variability exploration scenarios, should an agentic assessment system request human judgment so that important uncertainties are addressed without unnecessary expert burden? This question motivates the Selective Intervention Policy (M1) and its decision to escalate by exception rather than reviewing every case. It is addressed in Chapter 2 (§2.5) and Chapter 5 (§5.2).</w:t>
       </w:r>
     </w:p>
     <w:p>
@@ -3751,10 +3910,10 @@
         <w:rPr>
           <w:b/>
         </w:rPr>
-        <w:t>SQ3  -  Role of judgment.</w:t>
-      </w:r>
-      <w:r>
-        <w:t xml:space="preserve"> Is human judgment treated as a temporary correction for current AI limits, or as an essential, reusable asset? This is the central question of the thesis, and it motivates the Human Judgment Memory (M3) as a provenance-tracked, conflict-aware store rather than a transient label buffer. It is addressed in Chapter 2 (§2.6, §2.8) and Chapter 5 (§5.4).</w:t>
+        <w:t>SQ2  -  Governed knowledge reuse.</w:t>
+      </w:r>
+      <w:r>
+        <w:t xml:space="preserve"> How should expert judgment  -  including the system's core reasoning  -  be represented, validated, reconciled, and stored so it can be reused transparently without unsafe generalization or loss of human authority? This question underpins the bidirectional, structured design of the artifact (M2-M4A): the AI's evidence is preserved and the expert's rationale is captured, validated, stored with provenance, and resurfaced as advisory evidence. It is the central question of the thesis and is addressed in Chapter 2 (§2.6, §2.8) and Chapter 5 (§5.3-§5.5).</w:t>
       </w:r>
     </w:p>
     <w:p>
@@ -3762,10 +3921,10 @@
         <w:rPr>
           <w:b/>
         </w:rPr>
-        <w:t>SQ4  -  Structure and reuse.</w:t>
-      </w:r>
-      <w:r>
-        <w:t xml:space="preserve"> How (if at all) is human feedback structured, stored, and reused across cases, models, or runs? This question maps directly to the schema-validated feedback (M2), the judgment memory (M3), and the advisory retrieval (M4A). It is addressed in Chapter 5 and evaluated in Chapter 6.</w:t>
+        <w:t>SQ3  -  Evaluation and transfer.</w:t>
+      </w:r>
+      <w:r>
+        <w:t xml:space="preserve"> How can expert judgment be reused and transferred across different guideline-operationalization contexts without unsafe generalization or loss of human authority, first in software/modeling and, when governance and access permit, in healthcare? This question governs the non-destructive parallel comparison (M4B-1) and the evaluation methodology (Chapter 6): transfer is tested first within the current software-engineering domain, consistent with the domain-neutral framing in §3.6. It is addressed in Chapter 5 (§5.6) and evaluated in Chapter 6.</w:t>
       </w:r>
     </w:p>
     <w:p>
@@ -3773,19 +3932,30 @@
         <w:rPr>
           <w:b/>
         </w:rPr>
-        <w:t>SQ5  -  The MDE-assessment gap.</w:t>
-      </w:r>
-      <w:r>
-        <w:t xml:space="preserve"> What gap remains specifically for interpreting </w:t>
+        <w:t>On the retired SQ4/SQ5 (previous draft).</w:t>
+      </w:r>
+      <w:r>
+        <w:t xml:space="preserve"> The prior five-sub-question draft's SQ4 (structure and reuse) is absorbed into SQ2 (representation/storage) and SQ3 (the effect of reuse), and its SQ5 (the MDE-assessment gap) is retained as literature positioning rather than a numbered sub-question  -  it motivates </w:t>
       </w:r>
       <w:r>
         <w:rPr>
           <w:i/>
         </w:rPr>
-        <w:t>model variability</w:t>
-      </w:r>
-      <w:r>
-        <w:t>, and where does VEGO-AI sit within it? This question positions the contribution against the broader model-assessment literature and is addressed in Chapter 2 (§2.3, §2.4, §2.8).</w:t>
+        <w:t>why</w:t>
+      </w:r>
+      <w:r>
+        <w:t xml:space="preserve"> this problem is open (§3.1, Chapter 2) but is not itself a study. See </w:t>
+      </w:r>
+      <w:r>
+        <w:rPr>
+          <w:rFonts w:ascii="Consolas" w:hAnsi="Consolas"/>
+          <w:color w:val="1F4D78"/>
+          <w:sz w:val="18"/>
+        </w:rPr>
+        <w:t>docs/research/phd-proposal/legacy-rq-crosswalk.md</w:t>
+      </w:r>
+      <w:r>
+        <w:t xml:space="preserve"> §3 for the full item-by-item disposition; nothing from the prior draft is silently dropped.</w:t>
       </w:r>
     </w:p>
     <w:p>
@@ -3798,7 +3968,7 @@
     </w:p>
     <w:p>
       <w:r>
-        <w:t>The main RQ and SQ1-SQ5 govern the literature synthesis and artifact design. A separate set of empirical questions governs the accuracy-evidence phase. Keeping these sets distinct prevents the absence of performance labels from obscuring what the design-science work has already established.</w:t>
+        <w:t>The main RQ and SQ1-SQ3 govern the literature synthesis and artifact design. A separate set of empirical questions governs the accuracy-evidence phase. Keeping these sets distinct prevents the absence of performance labels from obscuring what the design-science work has already established.</w:t>
       </w:r>
     </w:p>
     <w:p>
@@ -4634,10 +4804,10 @@
         <w:tblInd w:w="120" w:type="dxa"/>
       </w:tblPr>
       <w:tblGrid>
-        <w:gridCol w:w="3009"/>
-        <w:gridCol w:w="2786"/>
-        <w:gridCol w:w="2117"/>
-        <w:gridCol w:w="1448"/>
+        <w:gridCol w:w="4122"/>
+        <w:gridCol w:w="2490"/>
+        <w:gridCol w:w="1632"/>
+        <w:gridCol w:w="1116"/>
       </w:tblGrid>
       <w:tr>
         <w:trPr>
@@ -4646,7 +4816,7 @@
         </w:trPr>
         <w:tc>
           <w:tcPr>
-            <w:tcW w:type="dxa" w:w="3009"/>
+            <w:tcW w:type="dxa" w:w="4122"/>
             <w:tcMar>
               <w:top w:w="80" w:type="dxa"/>
               <w:start w:w="120" w:type="dxa"/>
@@ -4675,7 +4845,7 @@
         </w:tc>
         <w:tc>
           <w:tcPr>
-            <w:tcW w:type="dxa" w:w="2786"/>
+            <w:tcW w:type="dxa" w:w="2490"/>
             <w:tcMar>
               <w:top w:w="80" w:type="dxa"/>
               <w:start w:w="120" w:type="dxa"/>
@@ -4704,7 +4874,7 @@
         </w:tc>
         <w:tc>
           <w:tcPr>
-            <w:tcW w:type="dxa" w:w="2117"/>
+            <w:tcW w:type="dxa" w:w="1632"/>
             <w:tcMar>
               <w:top w:w="80" w:type="dxa"/>
               <w:start w:w="120" w:type="dxa"/>
@@ -4733,7 +4903,7 @@
         </w:tc>
         <w:tc>
           <w:tcPr>
-            <w:tcW w:type="dxa" w:w="1448"/>
+            <w:tcW w:type="dxa" w:w="1116"/>
             <w:tcMar>
               <w:top w:w="80" w:type="dxa"/>
               <w:start w:w="120" w:type="dxa"/>
@@ -4767,7 +4937,7 @@
         </w:trPr>
         <w:tc>
           <w:tcPr>
-            <w:tcW w:type="dxa" w:w="3009"/>
+            <w:tcW w:type="dxa" w:w="4122"/>
             <w:tcMar>
               <w:top w:w="80" w:type="dxa"/>
               <w:start w:w="120" w:type="dxa"/>
@@ -4789,13 +4959,13 @@
                 <w:color w:val="1E232A"/>
                 <w:sz w:val="18"/>
               </w:rPr>
-              <w:t>SQ1 Control &amp; timing</w:t>
-            </w:r>
-          </w:p>
-        </w:tc>
-        <w:tc>
-          <w:tcPr>
-            <w:tcW w:type="dxa" w:w="2786"/>
+              <w:t>SQ1 Selective intervention</w:t>
+            </w:r>
+          </w:p>
+        </w:tc>
+        <w:tc>
+          <w:tcPr>
+            <w:tcW w:type="dxa" w:w="2490"/>
             <w:tcMar>
               <w:top w:w="80" w:type="dxa"/>
               <w:start w:w="120" w:type="dxa"/>
@@ -4823,7 +4993,7 @@
         </w:tc>
         <w:tc>
           <w:tcPr>
-            <w:tcW w:type="dxa" w:w="2117"/>
+            <w:tcW w:type="dxa" w:w="1632"/>
             <w:tcMar>
               <w:top w:w="80" w:type="dxa"/>
               <w:start w:w="120" w:type="dxa"/>
@@ -4851,7 +5021,7 @@
         </w:tc>
         <w:tc>
           <w:tcPr>
-            <w:tcW w:type="dxa" w:w="1448"/>
+            <w:tcW w:type="dxa" w:w="1116"/>
             <w:tcMar>
               <w:top w:w="80" w:type="dxa"/>
               <w:start w:w="120" w:type="dxa"/>
@@ -4884,7 +5054,7 @@
         </w:trPr>
         <w:tc>
           <w:tcPr>
-            <w:tcW w:type="dxa" w:w="3009"/>
+            <w:tcW w:type="dxa" w:w="4122"/>
             <w:tcMar>
               <w:top w:w="80" w:type="dxa"/>
               <w:start w:w="120" w:type="dxa"/>
@@ -4906,13 +5076,13 @@
                 <w:color w:val="1E232A"/>
                 <w:sz w:val="18"/>
               </w:rPr>
-              <w:t>SQ2 Information direction</w:t>
-            </w:r>
-          </w:p>
-        </w:tc>
-        <w:tc>
-          <w:tcPr>
-            <w:tcW w:type="dxa" w:w="2786"/>
+              <w:t>SQ2 Governed knowledge reuse</w:t>
+            </w:r>
+          </w:p>
+        </w:tc>
+        <w:tc>
+          <w:tcPr>
+            <w:tcW w:type="dxa" w:w="2490"/>
             <w:tcMar>
               <w:top w:w="80" w:type="dxa"/>
               <w:start w:w="120" w:type="dxa"/>
@@ -4934,13 +5104,13 @@
                 <w:color w:val="1E232A"/>
                 <w:sz w:val="18"/>
               </w:rPr>
-              <w:t>Ch 2 §2.6, Ch 5 §5.3-5.5</w:t>
-            </w:r>
-          </w:p>
-        </w:tc>
-        <w:tc>
-          <w:tcPr>
-            <w:tcW w:type="dxa" w:w="2117"/>
+              <w:t>Ch 2 §2.6/§2.8, Ch 5 §5.3-5.5</w:t>
+            </w:r>
+          </w:p>
+        </w:tc>
+        <w:tc>
+          <w:tcPr>
+            <w:tcW w:type="dxa" w:w="1632"/>
             <w:tcMar>
               <w:top w:w="80" w:type="dxa"/>
               <w:start w:w="120" w:type="dxa"/>
@@ -4968,7 +5138,7 @@
         </w:tc>
         <w:tc>
           <w:tcPr>
-            <w:tcW w:type="dxa" w:w="1448"/>
+            <w:tcW w:type="dxa" w:w="1116"/>
             <w:tcMar>
               <w:top w:w="80" w:type="dxa"/>
               <w:start w:w="120" w:type="dxa"/>
@@ -4990,7 +5160,7 @@
                 <w:color w:val="1E232A"/>
                 <w:sz w:val="18"/>
               </w:rPr>
-              <w:t>Ch 7 §7.3</w:t>
+              <w:t>Ch 7 §7.3-7.4</w:t>
             </w:r>
           </w:p>
         </w:tc>
@@ -5001,7 +5171,7 @@
         </w:trPr>
         <w:tc>
           <w:tcPr>
-            <w:tcW w:type="dxa" w:w="3009"/>
+            <w:tcW w:type="dxa" w:w="4122"/>
             <w:tcMar>
               <w:top w:w="80" w:type="dxa"/>
               <w:start w:w="120" w:type="dxa"/>
@@ -5023,13 +5193,13 @@
                 <w:color w:val="1E232A"/>
                 <w:sz w:val="18"/>
               </w:rPr>
-              <w:t>SQ3 Role of judgment</w:t>
-            </w:r>
-          </w:p>
-        </w:tc>
-        <w:tc>
-          <w:tcPr>
-            <w:tcW w:type="dxa" w:w="2786"/>
+              <w:t>SQ3 Evaluation and transfer</w:t>
+            </w:r>
+          </w:p>
+        </w:tc>
+        <w:tc>
+          <w:tcPr>
+            <w:tcW w:type="dxa" w:w="2490"/>
             <w:tcMar>
               <w:top w:w="80" w:type="dxa"/>
               <w:start w:w="120" w:type="dxa"/>
@@ -5042,22 +5212,22 @@
             <w:pPr>
               <w:keepNext/>
               <w:spacing w:before="0" w:after="0" w:line="252" w:lineRule="auto"/>
-              <w:jc w:val="left"/>
-            </w:pPr>
-            <w:r>
-              <w:rPr>
-                <w:rFonts w:ascii="Calibri" w:hAnsi="Calibri"/>
-                <w:b w:val="0"/>
-                <w:color w:val="1E232A"/>
-                <w:sz w:val="18"/>
-              </w:rPr>
-              <w:t>Ch 2 §2.6/§2.8, Ch 5 §5.4</w:t>
-            </w:r>
-          </w:p>
-        </w:tc>
-        <w:tc>
-          <w:tcPr>
-            <w:tcW w:type="dxa" w:w="2117"/>
+              <w:jc w:val="center"/>
+            </w:pPr>
+            <w:r>
+              <w:rPr>
+                <w:rFonts w:ascii="Calibri" w:hAnsi="Calibri"/>
+                <w:b w:val="0"/>
+                <w:color w:val="1E232A"/>
+                <w:sz w:val="18"/>
+              </w:rPr>
+              <w:t>Ch 5 §5.6</w:t>
+            </w:r>
+          </w:p>
+        </w:tc>
+        <w:tc>
+          <w:tcPr>
+            <w:tcW w:type="dxa" w:w="1632"/>
             <w:tcMar>
               <w:top w:w="80" w:type="dxa"/>
               <w:start w:w="120" w:type="dxa"/>
@@ -5070,22 +5240,22 @@
             <w:pPr>
               <w:keepNext/>
               <w:spacing w:before="0" w:after="0" w:line="252" w:lineRule="auto"/>
-              <w:jc w:val="left"/>
-            </w:pPr>
-            <w:r>
-              <w:rPr>
-                <w:rFonts w:ascii="Calibri" w:hAnsi="Calibri"/>
-                <w:b w:val="0"/>
-                <w:color w:val="1E232A"/>
-                <w:sz w:val="18"/>
-              </w:rPr>
-              <w:t>M3 Judgment Memory</w:t>
-            </w:r>
-          </w:p>
-        </w:tc>
-        <w:tc>
-          <w:tcPr>
-            <w:tcW w:type="dxa" w:w="1448"/>
+              <w:jc w:val="center"/>
+            </w:pPr>
+            <w:r>
+              <w:rPr>
+                <w:rFonts w:ascii="Calibri" w:hAnsi="Calibri"/>
+                <w:b w:val="0"/>
+                <w:color w:val="1E232A"/>
+                <w:sz w:val="18"/>
+              </w:rPr>
+              <w:t>M4B-1</w:t>
+            </w:r>
+          </w:p>
+        </w:tc>
+        <w:tc>
+          <w:tcPr>
+            <w:tcW w:type="dxa" w:w="1116"/>
             <w:tcMar>
               <w:top w:w="80" w:type="dxa"/>
               <w:start w:w="120" w:type="dxa"/>
@@ -5107,7 +5277,7 @@
                 <w:color w:val="1E232A"/>
                 <w:sz w:val="18"/>
               </w:rPr>
-              <w:t>Ch 7 §7.3-7.4</w:t>
+              <w:t>Ch 6, Ch 7</w:t>
             </w:r>
           </w:p>
         </w:tc>
@@ -5118,7 +5288,7 @@
         </w:trPr>
         <w:tc>
           <w:tcPr>
-            <w:tcW w:type="dxa" w:w="3009"/>
+            <w:tcW w:type="dxa" w:w="4122"/>
             <w:tcMar>
               <w:top w:w="80" w:type="dxa"/>
               <w:start w:w="120" w:type="dxa"/>
@@ -5140,13 +5310,13 @@
                 <w:color w:val="1E232A"/>
                 <w:sz w:val="18"/>
               </w:rPr>
-              <w:t>SQ4 Structure &amp; reuse</w:t>
-            </w:r>
-          </w:p>
-        </w:tc>
-        <w:tc>
-          <w:tcPr>
-            <w:tcW w:type="dxa" w:w="2786"/>
+              <w:t>MDE-assessment gap (positioning, not a numbered SQ)</w:t>
+            </w:r>
+          </w:p>
+        </w:tc>
+        <w:tc>
+          <w:tcPr>
+            <w:tcW w:type="dxa" w:w="2490"/>
             <w:tcMar>
               <w:top w:w="80" w:type="dxa"/>
               <w:start w:w="120" w:type="dxa"/>
@@ -5159,6 +5329,34 @@
             <w:pPr>
               <w:keepNext/>
               <w:spacing w:before="0" w:after="0" w:line="252" w:lineRule="auto"/>
+              <w:jc w:val="left"/>
+            </w:pPr>
+            <w:r>
+              <w:rPr>
+                <w:rFonts w:ascii="Calibri" w:hAnsi="Calibri"/>
+                <w:b w:val="0"/>
+                <w:color w:val="1E232A"/>
+                <w:sz w:val="18"/>
+              </w:rPr>
+              <w:t>Ch 2 §2.3/§2.4/§2.8</w:t>
+            </w:r>
+          </w:p>
+        </w:tc>
+        <w:tc>
+          <w:tcPr>
+            <w:tcW w:type="dxa" w:w="1632"/>
+            <w:tcMar>
+              <w:top w:w="80" w:type="dxa"/>
+              <w:start w:w="120" w:type="dxa"/>
+              <w:bottom w:w="80" w:type="dxa"/>
+              <w:end w:w="120" w:type="dxa"/>
+            </w:tcMar>
+            <w:vAlign w:val="center"/>
+          </w:tcPr>
+          <w:p>
+            <w:pPr>
+              <w:keepNext/>
+              <w:spacing w:before="0" w:after="0" w:line="252" w:lineRule="auto"/>
               <w:jc w:val="center"/>
             </w:pPr>
             <w:r>
@@ -5168,13 +5366,13 @@
                 <w:color w:val="1E232A"/>
                 <w:sz w:val="18"/>
               </w:rPr>
-              <w:t>Ch 5 §5.3-5.6</w:t>
-            </w:r>
-          </w:p>
-        </w:tc>
-        <w:tc>
-          <w:tcPr>
-            <w:tcW w:type="dxa" w:w="2117"/>
+              <w:t xml:space="preserve"> -  (positioning)</w:t>
+            </w:r>
+          </w:p>
+        </w:tc>
+        <w:tc>
+          <w:tcPr>
+            <w:tcW w:type="dxa" w:w="1116"/>
             <w:tcMar>
               <w:top w:w="80" w:type="dxa"/>
               <w:start w:w="120" w:type="dxa"/>
@@ -5196,35 +5394,7 @@
                 <w:color w:val="1E232A"/>
                 <w:sz w:val="18"/>
               </w:rPr>
-              <w:t>M2-M4B-1</w:t>
-            </w:r>
-          </w:p>
-        </w:tc>
-        <w:tc>
-          <w:tcPr>
-            <w:tcW w:type="dxa" w:w="1448"/>
-            <w:tcMar>
-              <w:top w:w="80" w:type="dxa"/>
-              <w:start w:w="120" w:type="dxa"/>
-              <w:bottom w:w="80" w:type="dxa"/>
-              <w:end w:w="120" w:type="dxa"/>
-            </w:tcMar>
-            <w:vAlign w:val="center"/>
-          </w:tcPr>
-          <w:p>
-            <w:pPr>
-              <w:keepNext/>
-              <w:spacing w:before="0" w:after="0" w:line="252" w:lineRule="auto"/>
-              <w:jc w:val="center"/>
-            </w:pPr>
-            <w:r>
-              <w:rPr>
-                <w:rFonts w:ascii="Calibri" w:hAnsi="Calibri"/>
-                <w:b w:val="0"/>
-                <w:color w:val="1E232A"/>
-                <w:sz w:val="18"/>
-              </w:rPr>
-              <w:t>Ch 6, Ch 7</w:t>
+              <w:t>Ch 9 §9.1</w:t>
             </w:r>
           </w:p>
         </w:tc>
@@ -5235,7 +5405,7 @@
         </w:trPr>
         <w:tc>
           <w:tcPr>
-            <w:tcW w:type="dxa" w:w="3009"/>
+            <w:tcW w:type="dxa" w:w="4122"/>
             <w:tcMar>
               <w:top w:w="80" w:type="dxa"/>
               <w:start w:w="120" w:type="dxa"/>
@@ -5257,13 +5427,13 @@
                 <w:color w:val="1E232A"/>
                 <w:sz w:val="18"/>
               </w:rPr>
-              <w:t>SQ5 MDE-assessment gap</w:t>
-            </w:r>
-          </w:p>
-        </w:tc>
-        <w:tc>
-          <w:tcPr>
-            <w:tcW w:type="dxa" w:w="2786"/>
+              <w:t>E-RQ1 Baseline errors</w:t>
+            </w:r>
+          </w:p>
+        </w:tc>
+        <w:tc>
+          <w:tcPr>
+            <w:tcW w:type="dxa" w:w="2490"/>
             <w:tcMar>
               <w:top w:w="80" w:type="dxa"/>
               <w:start w:w="120" w:type="dxa"/>
@@ -5276,22 +5446,22 @@
             <w:pPr>
               <w:keepNext/>
               <w:spacing w:before="0" w:after="0" w:line="252" w:lineRule="auto"/>
-              <w:jc w:val="left"/>
-            </w:pPr>
-            <w:r>
-              <w:rPr>
-                <w:rFonts w:ascii="Calibri" w:hAnsi="Calibri"/>
-                <w:b w:val="0"/>
-                <w:color w:val="1E232A"/>
-                <w:sz w:val="18"/>
-              </w:rPr>
-              <w:t>Ch 2 §2.3/§2.4/§2.8</w:t>
-            </w:r>
-          </w:p>
-        </w:tc>
-        <w:tc>
-          <w:tcPr>
-            <w:tcW w:type="dxa" w:w="2117"/>
+              <w:jc w:val="center"/>
+            </w:pPr>
+            <w:r>
+              <w:rPr>
+                <w:rFonts w:ascii="Calibri" w:hAnsi="Calibri"/>
+                <w:b w:val="0"/>
+                <w:color w:val="1E232A"/>
+                <w:sz w:val="18"/>
+              </w:rPr>
+              <w:t>Ch 6 §6.10</w:t>
+            </w:r>
+          </w:p>
+        </w:tc>
+        <w:tc>
+          <w:tcPr>
+            <w:tcW w:type="dxa" w:w="1632"/>
             <w:tcMar>
               <w:top w:w="80" w:type="dxa"/>
               <w:start w:w="120" w:type="dxa"/>
@@ -5313,13 +5483,13 @@
                 <w:color w:val="1E232A"/>
                 <w:sz w:val="18"/>
               </w:rPr>
-              <w:t xml:space="preserve"> -  (positioning)</w:t>
-            </w:r>
-          </w:p>
-        </w:tc>
-        <w:tc>
-          <w:tcPr>
-            <w:tcW w:type="dxa" w:w="1448"/>
+              <w:t>B0/B2</w:t>
+            </w:r>
+          </w:p>
+        </w:tc>
+        <w:tc>
+          <w:tcPr>
+            <w:tcW w:type="dxa" w:w="1116"/>
             <w:tcMar>
               <w:top w:w="80" w:type="dxa"/>
               <w:start w:w="120" w:type="dxa"/>
@@ -5341,7 +5511,7 @@
                 <w:color w:val="1E232A"/>
                 <w:sz w:val="18"/>
               </w:rPr>
-              <w:t>Ch 9 §9.1</w:t>
+              <w:t>EXP-020/021</w:t>
             </w:r>
           </w:p>
         </w:tc>
@@ -5352,7 +5522,7 @@
         </w:trPr>
         <w:tc>
           <w:tcPr>
-            <w:tcW w:type="dxa" w:w="3009"/>
+            <w:tcW w:type="dxa" w:w="4122"/>
             <w:tcMar>
               <w:top w:w="80" w:type="dxa"/>
               <w:start w:w="120" w:type="dxa"/>
@@ -5374,13 +5544,13 @@
                 <w:color w:val="1E232A"/>
                 <w:sz w:val="18"/>
               </w:rPr>
-              <w:t>E-RQ1 Baseline errors</w:t>
-            </w:r>
-          </w:p>
-        </w:tc>
-        <w:tc>
-          <w:tcPr>
-            <w:tcW w:type="dxa" w:w="2786"/>
+              <w:t>E-RQ2 Targeting &amp; retrieval</w:t>
+            </w:r>
+          </w:p>
+        </w:tc>
+        <w:tc>
+          <w:tcPr>
+            <w:tcW w:type="dxa" w:w="2490"/>
             <w:tcMar>
               <w:top w:w="80" w:type="dxa"/>
               <w:start w:w="120" w:type="dxa"/>
@@ -5408,7 +5578,7 @@
         </w:tc>
         <w:tc>
           <w:tcPr>
-            <w:tcW w:type="dxa" w:w="2117"/>
+            <w:tcW w:type="dxa" w:w="1632"/>
             <w:tcMar>
               <w:top w:w="80" w:type="dxa"/>
               <w:start w:w="120" w:type="dxa"/>
@@ -5430,13 +5600,13 @@
                 <w:color w:val="1E232A"/>
                 <w:sz w:val="18"/>
               </w:rPr>
-              <w:t>B0/B2</w:t>
-            </w:r>
-          </w:p>
-        </w:tc>
-        <w:tc>
-          <w:tcPr>
-            <w:tcW w:type="dxa" w:w="1448"/>
+              <w:t>M1/M3/M4A</w:t>
+            </w:r>
+          </w:p>
+        </w:tc>
+        <w:tc>
+          <w:tcPr>
+            <w:tcW w:type="dxa" w:w="1116"/>
             <w:tcMar>
               <w:top w:w="80" w:type="dxa"/>
               <w:start w:w="120" w:type="dxa"/>
@@ -5458,7 +5628,7 @@
                 <w:color w:val="1E232A"/>
                 <w:sz w:val="18"/>
               </w:rPr>
-              <w:t>EXP-020/021</w:t>
+              <w:t>EXP-022</w:t>
             </w:r>
           </w:p>
         </w:tc>
@@ -5469,18 +5639,18 @@
         </w:trPr>
         <w:tc>
           <w:tcPr>
-            <w:tcW w:type="dxa" w:w="3009"/>
-            <w:tcMar>
-              <w:top w:w="80" w:type="dxa"/>
-              <w:start w:w="120" w:type="dxa"/>
-              <w:bottom w:w="80" w:type="dxa"/>
-              <w:end w:w="120" w:type="dxa"/>
-            </w:tcMar>
-            <w:vAlign w:val="center"/>
-          </w:tcPr>
-          <w:p>
-            <w:pPr>
-              <w:keepNext/>
+            <w:tcW w:type="dxa" w:w="4122"/>
+            <w:tcMar>
+              <w:top w:w="80" w:type="dxa"/>
+              <w:start w:w="120" w:type="dxa"/>
+              <w:bottom w:w="80" w:type="dxa"/>
+              <w:end w:w="120" w:type="dxa"/>
+            </w:tcMar>
+            <w:vAlign w:val="center"/>
+          </w:tcPr>
+          <w:p>
+            <w:pPr>
+              <w:keepNext w:val="0"/>
               <w:spacing w:before="0" w:after="0" w:line="252" w:lineRule="auto"/>
               <w:jc w:val="left"/>
             </w:pPr>
@@ -5491,24 +5661,24 @@
                 <w:color w:val="1E232A"/>
                 <w:sz w:val="18"/>
               </w:rPr>
-              <w:t>E-RQ2 Targeting &amp; retrieval</w:t>
-            </w:r>
-          </w:p>
-        </w:tc>
-        <w:tc>
-          <w:tcPr>
-            <w:tcW w:type="dxa" w:w="2786"/>
-            <w:tcMar>
-              <w:top w:w="80" w:type="dxa"/>
-              <w:start w:w="120" w:type="dxa"/>
-              <w:bottom w:w="80" w:type="dxa"/>
-              <w:end w:w="120" w:type="dxa"/>
-            </w:tcMar>
-            <w:vAlign w:val="center"/>
-          </w:tcPr>
-          <w:p>
-            <w:pPr>
-              <w:keepNext/>
+              <w:t>E-RQ3 Unseen paired effect</w:t>
+            </w:r>
+          </w:p>
+        </w:tc>
+        <w:tc>
+          <w:tcPr>
+            <w:tcW w:type="dxa" w:w="2490"/>
+            <w:tcMar>
+              <w:top w:w="80" w:type="dxa"/>
+              <w:start w:w="120" w:type="dxa"/>
+              <w:bottom w:w="80" w:type="dxa"/>
+              <w:end w:w="120" w:type="dxa"/>
+            </w:tcMar>
+            <w:vAlign w:val="center"/>
+          </w:tcPr>
+          <w:p>
+            <w:pPr>
+              <w:keepNext w:val="0"/>
               <w:spacing w:before="0" w:after="0" w:line="252" w:lineRule="auto"/>
               <w:jc w:val="center"/>
             </w:pPr>
@@ -5525,18 +5695,18 @@
         </w:tc>
         <w:tc>
           <w:tcPr>
-            <w:tcW w:type="dxa" w:w="2117"/>
-            <w:tcMar>
-              <w:top w:w="80" w:type="dxa"/>
-              <w:start w:w="120" w:type="dxa"/>
-              <w:bottom w:w="80" w:type="dxa"/>
-              <w:end w:w="120" w:type="dxa"/>
-            </w:tcMar>
-            <w:vAlign w:val="center"/>
-          </w:tcPr>
-          <w:p>
-            <w:pPr>
-              <w:keepNext/>
+            <w:tcW w:type="dxa" w:w="1632"/>
+            <w:tcMar>
+              <w:top w:w="80" w:type="dxa"/>
+              <w:start w:w="120" w:type="dxa"/>
+              <w:bottom w:w="80" w:type="dxa"/>
+              <w:end w:w="120" w:type="dxa"/>
+            </w:tcMar>
+            <w:vAlign w:val="center"/>
+          </w:tcPr>
+          <w:p>
+            <w:pPr>
+              <w:keepNext w:val="0"/>
               <w:spacing w:before="0" w:after="0" w:line="252" w:lineRule="auto"/>
               <w:jc w:val="center"/>
             </w:pPr>
@@ -5547,130 +5717,13 @@
                 <w:color w:val="1E232A"/>
                 <w:sz w:val="18"/>
               </w:rPr>
-              <w:t>M1/M3/M4A</w:t>
-            </w:r>
-          </w:p>
-        </w:tc>
-        <w:tc>
-          <w:tcPr>
-            <w:tcW w:type="dxa" w:w="1448"/>
-            <w:tcMar>
-              <w:top w:w="80" w:type="dxa"/>
-              <w:start w:w="120" w:type="dxa"/>
-              <w:bottom w:w="80" w:type="dxa"/>
-              <w:end w:w="120" w:type="dxa"/>
-            </w:tcMar>
-            <w:vAlign w:val="center"/>
-          </w:tcPr>
-          <w:p>
-            <w:pPr>
-              <w:keepNext/>
-              <w:spacing w:before="0" w:after="0" w:line="252" w:lineRule="auto"/>
-              <w:jc w:val="center"/>
-            </w:pPr>
-            <w:r>
-              <w:rPr>
-                <w:rFonts w:ascii="Calibri" w:hAnsi="Calibri"/>
-                <w:b w:val="0"/>
-                <w:color w:val="1E232A"/>
-                <w:sz w:val="18"/>
-              </w:rPr>
-              <w:t>EXP-022</w:t>
-            </w:r>
-          </w:p>
-        </w:tc>
-      </w:tr>
-      <w:tr>
-        <w:trPr>
-          <w:cantSplit/>
-        </w:trPr>
-        <w:tc>
-          <w:tcPr>
-            <w:tcW w:type="dxa" w:w="3009"/>
-            <w:tcMar>
-              <w:top w:w="80" w:type="dxa"/>
-              <w:start w:w="120" w:type="dxa"/>
-              <w:bottom w:w="80" w:type="dxa"/>
-              <w:end w:w="120" w:type="dxa"/>
-            </w:tcMar>
-            <w:vAlign w:val="center"/>
-          </w:tcPr>
-          <w:p>
-            <w:pPr>
-              <w:keepNext w:val="0"/>
-              <w:spacing w:before="0" w:after="0" w:line="252" w:lineRule="auto"/>
-              <w:jc w:val="left"/>
-            </w:pPr>
-            <w:r>
-              <w:rPr>
-                <w:rFonts w:ascii="Calibri" w:hAnsi="Calibri"/>
-                <w:b w:val="0"/>
-                <w:color w:val="1E232A"/>
-                <w:sz w:val="18"/>
-              </w:rPr>
-              <w:t>E-RQ3 Unseen paired effect</w:t>
-            </w:r>
-          </w:p>
-        </w:tc>
-        <w:tc>
-          <w:tcPr>
-            <w:tcW w:type="dxa" w:w="2786"/>
-            <w:tcMar>
-              <w:top w:w="80" w:type="dxa"/>
-              <w:start w:w="120" w:type="dxa"/>
-              <w:bottom w:w="80" w:type="dxa"/>
-              <w:end w:w="120" w:type="dxa"/>
-            </w:tcMar>
-            <w:vAlign w:val="center"/>
-          </w:tcPr>
-          <w:p>
-            <w:pPr>
-              <w:keepNext w:val="0"/>
-              <w:spacing w:before="0" w:after="0" w:line="252" w:lineRule="auto"/>
-              <w:jc w:val="center"/>
-            </w:pPr>
-            <w:r>
-              <w:rPr>
-                <w:rFonts w:ascii="Calibri" w:hAnsi="Calibri"/>
-                <w:b w:val="0"/>
-                <w:color w:val="1E232A"/>
-                <w:sz w:val="18"/>
-              </w:rPr>
-              <w:t>Ch 6 §6.10</w:t>
-            </w:r>
-          </w:p>
-        </w:tc>
-        <w:tc>
-          <w:tcPr>
-            <w:tcW w:type="dxa" w:w="2117"/>
-            <w:tcMar>
-              <w:top w:w="80" w:type="dxa"/>
-              <w:start w:w="120" w:type="dxa"/>
-              <w:bottom w:w="80" w:type="dxa"/>
-              <w:end w:w="120" w:type="dxa"/>
-            </w:tcMar>
-            <w:vAlign w:val="center"/>
-          </w:tcPr>
-          <w:p>
-            <w:pPr>
-              <w:keepNext w:val="0"/>
-              <w:spacing w:before="0" w:after="0" w:line="252" w:lineRule="auto"/>
-              <w:jc w:val="center"/>
-            </w:pPr>
-            <w:r>
-              <w:rPr>
-                <w:rFonts w:ascii="Calibri" w:hAnsi="Calibri"/>
-                <w:b w:val="0"/>
-                <w:color w:val="1E232A"/>
-                <w:sz w:val="18"/>
-              </w:rPr>
               <w:t>B3-B5</w:t>
             </w:r>
           </w:p>
         </w:tc>
         <w:tc>
           <w:tcPr>
-            <w:tcW w:type="dxa" w:w="1448"/>
+            <w:tcW w:type="dxa" w:w="1116"/>
             <w:tcMar>
               <w:top w:w="80" w:type="dxa"/>
               <w:start w:w="120" w:type="dxa"/>
@@ -5702,6 +5755,14 @@
       <w:pPr>
         <w:spacing w:after="40"/>
       </w:pPr>
+    </w:p>
+    <w:p>
+      <w:r>
+        <w:rPr>
+          <w:i/>
+        </w:rPr>
+        <w:t>Crosswalk from the prior five-sub-question draft is in `docs/research/phd-proposal/legacy-rq-crosswalk.md` §3.</w:t>
+      </w:r>
     </w:p>
     <w:p>
       <w:pPr>
@@ -7964,7 +8025,7 @@
         <w:rPr>
           <w:i/>
         </w:rPr>
-        <w:t>Contribution to SQ1:</w:t>
+        <w:t>Contribution to SQ1 (selective intervention):</w:t>
       </w:r>
       <w:r>
         <w:t xml:space="preserve"> VEGO-AI can now identify and persist where human judgment is requested, instead of leaving the signal unused. The current policy routes 11 of 27 patterns rather than routing every pattern. Whether this selection captures the cases that matter most or reduces reviewer effort without harmful misses remains an empirical question for EXP-021, EXP-022, and EXP-026.</w:t>
@@ -8152,7 +8213,7 @@
         <w:rPr>
           <w:i/>
         </w:rPr>
-        <w:t>Contribution to SQ2/SQ4:</w:t>
+        <w:t>Contribution to SQ2 (governed knowledge reuse):</w:t>
       </w:r>
       <w:r>
         <w:t xml:space="preserve"> Human feedback becomes structured, validated, and linked to the specific AI decision it addresses. Information flows bidirectionally: the AI's evidence and justification inform the human's review, and the human's structured decision feeds forward into the memory layer.</w:t>
@@ -8449,7 +8510,7 @@
         <w:rPr>
           <w:i/>
         </w:rPr>
-        <w:t>Contribution to SQ3/SQ4:</w:t>
+        <w:t>Contribution to SQ2 (governed knowledge reuse):</w:t>
       </w:r>
       <w:r>
         <w:t xml:space="preserve"> Expert judgment becomes durable, queryable, provenance-tracked knowledge. A judgment about "Customer as an actor" is not discarded after one case but stored with scope and provenance and surfaced when a similar pattern recurs  -  even in a different setting or domain.</w:t>
@@ -8585,7 +8646,7 @@
         <w:rPr>
           <w:i/>
         </w:rPr>
-        <w:t>Contribution to SQ2:</w:t>
+        <w:t>Contribution to SQ2 (governed knowledge reuse):</w:t>
       </w:r>
       <w:r>
         <w:t xml:space="preserve"> Reusable human judgment is surfaced as advisory evidence while the original AI output is preserved verbatim. Information flows in both directions: the AI's classification provides the context for retrieval, and the human's past judgments provide advisory evidence for the current case.</w:t>
@@ -9725,7 +9786,7 @@
         <w:rPr>
           <w:i/>
         </w:rPr>
-        <w:t>Contribution to SQ4:</w:t>
+        <w:t>Contribution to SQ3 (evaluation and transfer):</w:t>
       </w:r>
       <w:r>
         <w:t xml:space="preserve"> Reusable human judgment can drive a measurable, non-destructive comparison without changing the original result. The comparison artifact is the input to the empirical evaluation (Chapter 6), which will measure whether the memory-informed classifications are more accurate than the originals when compared against independent expert labels.</w:t>
@@ -22669,16 +22730,100 @@
       </w:r>
     </w:p>
     <w:p>
-      <w:r>
-        <w:t>The research question (RQ) asks what approaches have been proposed to support human-AI collaboration in AI-assisted domain modeling and model assessment, and how they can inform the design of reusable human-judgment mechanisms. The five sub-questions map to specific findings.</w:t>
-      </w:r>
-    </w:p>
-    <w:p>
+      <w:pPr>
+        <w:pStyle w:val="EvidenceCallout"/>
+        <w:shd w:fill="EEF5FA"/>
+        <w:pBdr>
+          <w:left w:val="single" w:sz="18" w:space="8" w:color="2E74B5"/>
+        </w:pBdr>
+      </w:pPr>
       <w:r>
         <w:rPr>
           <w:b/>
         </w:rPr>
-        <w:t>SQ1  -  Control and timing.</w:t>
+        <w:t>2026-08-10 migration note:</w:t>
+      </w:r>
+      <w:r>
+        <w:t xml:space="preserve"> this section previously mapped findings to a five-sub-question draft (</w:t>
+      </w:r>
+      <w:r>
+        <w:rPr>
+          <w:rFonts w:ascii="Consolas" w:hAnsi="Consolas"/>
+          <w:color w:val="1F4D78"/>
+          <w:sz w:val="18"/>
+        </w:rPr>
+        <w:t>SQ1</w:t>
+      </w:r>
+      <w:r>
+        <w:t xml:space="preserve"> control/timing, </w:t>
+      </w:r>
+      <w:r>
+        <w:rPr>
+          <w:rFonts w:ascii="Consolas" w:hAnsi="Consolas"/>
+          <w:color w:val="1F4D78"/>
+          <w:sz w:val="18"/>
+        </w:rPr>
+        <w:t>SQ2</w:t>
+      </w:r>
+      <w:r>
+        <w:t xml:space="preserve"> information direction, </w:t>
+      </w:r>
+      <w:r>
+        <w:rPr>
+          <w:rFonts w:ascii="Consolas" w:hAnsi="Consolas"/>
+          <w:color w:val="1F4D78"/>
+          <w:sz w:val="18"/>
+        </w:rPr>
+        <w:t>SQ3</w:t>
+      </w:r>
+      <w:r>
+        <w:t xml:space="preserve"> role of judgment, </w:t>
+      </w:r>
+      <w:r>
+        <w:rPr>
+          <w:rFonts w:ascii="Consolas" w:hAnsi="Consolas"/>
+          <w:color w:val="1F4D78"/>
+          <w:sz w:val="18"/>
+        </w:rPr>
+        <w:t>SQ4</w:t>
+      </w:r>
+      <w:r>
+        <w:t xml:space="preserve"> structure/reuse, </w:t>
+      </w:r>
+      <w:r>
+        <w:rPr>
+          <w:rFonts w:ascii="Consolas" w:hAnsi="Consolas"/>
+          <w:color w:val="1F4D78"/>
+          <w:sz w:val="18"/>
+        </w:rPr>
+        <w:t>SQ5</w:t>
+      </w:r>
+      <w:r>
+        <w:t xml:space="preserve"> MDE-assessment gap). It now maps to the exactly-three-subquestion structure adopted in Chapter 3 §3.3. No finding below is new; each is carried over from the corresponding prior sub-question per </w:t>
+      </w:r>
+      <w:r>
+        <w:rPr>
+          <w:rFonts w:ascii="Consolas" w:hAnsi="Consolas"/>
+          <w:color w:val="1F4D78"/>
+          <w:sz w:val="18"/>
+        </w:rPr>
+        <w:t>docs/research/phd-proposal/legacy-rq-crosswalk.md</w:t>
+      </w:r>
+      <w:r>
+        <w:t xml:space="preserve"> §3.</w:t>
+      </w:r>
+    </w:p>
+    <w:p>
+      <w:r>
+        <w:t>The research question (U-RQ) asks how human judgment can be captured, governed, and used to support agentic-AI-driven variability exploration in guideline operationalization scenarios, enabling reliable human-AI co-reasoning. The three sub-questions map to specific findings.</w:t>
+      </w:r>
+    </w:p>
+    <w:p>
+      <w:r>
+        <w:rPr>
+          <w:b/>
+        </w:rPr>
+        <w:t>SQ1  -  Selective intervention.</w:t>
       </w:r>
       <w:r>
         <w:t xml:space="preserve"> The literature review (§2.5) identifies three patterns: human-in-the-loop (the human is part of every decision cycle), human-on-the-loop (the human monitors and intervenes by exception), and human-AI co-reasoning (both parties contribute reasoning that remains visible and reusable). The thesis artifact positions itself between on-the-loop and co-reasoning: the Selective Intervention Policy (M1) escalates by exception (on-the-loop), but the human's rationale becomes durable, retrievable evidence (co-reasoning). This combination is not found in the surveyed literature.</w:t>
@@ -22689,10 +22834,37 @@
         <w:rPr>
           <w:b/>
         </w:rPr>
-        <w:t>SQ2  -  Direction of information.</w:t>
-      </w:r>
-      <w:r>
-        <w:t xml:space="preserve"> The surveyed systems predominantly flow information AI→human: the AI explains, and the human consumes the explanation. Where human→AI flow exists (in HITL systems), the input is typically a label or correction, not a structured, rationale-bearing judgment. The thesis artifact implements bidirectional flow: the AI's evidence and justification inform the human's review (M1), and the human's structured decision (M2) feeds forward through memory (M3), advisory retrieval (M4A), and controlled comparison (M4B-1).</w:t>
+        <w:t>SQ2  -  Governed knowledge reuse.</w:t>
+      </w:r>
+      <w:r>
+        <w:t xml:space="preserve"> Three findings from the prior literature review converge on this question. </w:t>
+      </w:r>
+      <w:r>
+        <w:rPr>
+          <w:i/>
+        </w:rPr>
+        <w:t>Direction of information:</w:t>
+      </w:r>
+      <w:r>
+        <w:t xml:space="preserve"> the surveyed systems predominantly flow information AI→human (the AI explains, and the human consumes the explanation); where human→AI flow exists (in HITL systems), the input is typically a label or correction, not a structured, rationale-bearing judgment. The thesis artifact implements bidirectional flow instead: the AI's evidence and justification inform the human's review (M1), and the human's structured decision (M2) feeds forward through memory (M3) and advisory retrieval (M4A). </w:t>
+      </w:r>
+      <w:r>
+        <w:rPr>
+          <w:i/>
+        </w:rPr>
+        <w:t>Role of judgment:</w:t>
+      </w:r>
+      <w:r>
+        <w:t xml:space="preserve"> across the surveyed work, human judgment is treated as a temporary correction for current AI limits  -  it fixes the immediate case but does not accumulate. The thesis artifact treats human judgment as an essential, reusable asset: the Human Judgment Memory (M3) stores it with provenance, scope, conflict status, and match reasons, making it retrievable for future similar cases even if the underlying LLM improves. </w:t>
+      </w:r>
+      <w:r>
+        <w:rPr>
+          <w:i/>
+        </w:rPr>
+        <w:t>Structure:</w:t>
+      </w:r>
+      <w:r>
+        <w:t xml:space="preserve"> no surveyed system provides the combination of schema-validated feedback capture (M2), provenance-tracked memory storage (M3), and explainable embedding-free retrieval (M3/M4A). Individual elements exist  -  structured feedback in annotation tools, memory in case-based reasoning systems, advisory retrieval in recommendation engines  -  but the specific combination for model-variability assessment is novel.</w:t>
       </w:r>
     </w:p>
     <w:p>
@@ -22700,10 +22872,19 @@
         <w:rPr>
           <w:b/>
         </w:rPr>
-        <w:t>SQ3  -  Role of judgment.</w:t>
-      </w:r>
-      <w:r>
-        <w:t xml:space="preserve"> Across the surveyed work, human judgment is treated as a temporary correction for current AI limits  -  it fixes the immediate case but does not accumulate. The thesis artifact treats human judgment as an essential, reusable asset: the Human Judgment Memory (M3) stores it with provenance, scope, conflict status, and match reasons, making it retrievable for future similar cases even if the underlying LLM improves.</w:t>
+        <w:t>SQ3  -  Evaluation and transfer.</w:t>
+      </w:r>
+      <w:r>
+        <w:t xml:space="preserve"> The deterministic parallel comparison (M4B-1, §5.6) is the mechanism that makes reuse </w:t>
+      </w:r>
+      <w:r>
+        <w:rPr>
+          <w:i/>
+        </w:rPr>
+        <w:t>measurable</w:t>
+      </w:r>
+      <w:r>
+        <w:t xml:space="preserve"> without changing the original result: it is the artifact that Chapters 6-7 evaluate to ask whether memory-informed classifications transfer safely across settings. No surveyed system pairs a provenance-tracked judgment store with a non-destructive, deterministic comparison mechanism built specifically to test transfer without contaminating the baseline. Whether transfer in fact holds  -  within the current software-engineering domain, and toward a second domain when governance and access permit  -  is an empirical question answered (or left open) by the evidence gates of Chapter 6, not asserted here.</w:t>
       </w:r>
     </w:p>
     <w:p>
@@ -22711,21 +22892,10 @@
         <w:rPr>
           <w:b/>
         </w:rPr>
-        <w:t>SQ4  -  Structure and reuse.</w:t>
-      </w:r>
-      <w:r>
-        <w:t xml:space="preserve"> No surveyed system provides the combination of schema-validated feedback capture (M2), provenance-tracked memory storage (M3), explainable embedding-free retrieval (M3/M4A), and deterministic parallel comparison (M4B-1). Individual elements exist  -  structured feedback in annotation tools, memory in case-based reasoning systems, advisory retrieval in recommendation engines  -  but the specific combination for model-variability assessment is novel.</w:t>
-      </w:r>
-    </w:p>
-    <w:p>
-      <w:r>
-        <w:rPr>
-          <w:b/>
-        </w:rPr>
-        <w:t>SQ5  -  The MDE-assessment gap.</w:t>
-      </w:r>
-      <w:r>
-        <w:t xml:space="preserve"> The gap in the model-assessment literature (§2.3) is the single-reference, error-centric stance: deviation is treated as defect (Bian et al., 2019; Ibáñez et al., 2025). VEGO-AI addresses this with the substantial/occasional distinction, and this thesis adds the missing human-judgment lifecycle. The running example (§4.4, §5.6, §7.3) makes this concrete: Agent 4 classifies "Customer as actor" as an error, but a human expert recognizes it as a valid alternative  -  a judgment that, once stored, can inform future assessments of similar patterns. The combination  -  variability-aware AI assessment </w:t>
+        <w:t>Positioning: the MDE-assessment gap</w:t>
+      </w:r>
+      <w:r>
+        <w:t xml:space="preserve"> (retained as literature positioning per the crosswalk, not a numbered sub-question). The gap in the model-assessment literature (§2.3) is the single-reference, error-centric stance: deviation is treated as defect (Bian et al., 2019; Ibáñez et al., 2025). VEGO-AI addresses this with the substantial/occasional distinction, and this thesis adds the missing human-judgment lifecycle. The running example (§4.4, §5.6, §7.3) makes this concrete: Agent 4 classifies "Customer as actor" as an error, but a human expert recognizes it as a valid alternative  -  a judgment that, once stored, can inform future assessments of similar patterns. The combination  -  variability-aware AI assessment </w:t>
       </w:r>
       <w:r>
         <w:rPr>
@@ -24146,14 +24316,54 @@
       </w:r>
     </w:p>
     <w:p>
+      <w:pPr>
+        <w:pStyle w:val="EvidenceCallout"/>
+        <w:shd w:fill="EEF5FA"/>
+        <w:pBdr>
+          <w:left w:val="single" w:sz="18" w:space="8" w:color="2E74B5"/>
+        </w:pBdr>
+      </w:pPr>
       <w:r>
         <w:rPr>
           <w:b/>
         </w:rPr>
-        <w:t>RQ.</w:t>
-      </w:r>
-      <w:r>
-        <w:t xml:space="preserve"> The research question asked what approaches support human-AI collaboration in AI-assisted domain modeling and model assessment, and how they can inform the design of reusable human-judgment mechanisms. The thesis answered this by surveying six areas of related work, identifying four gaps, and demonstrating a concrete artifact that closes them.</w:t>
+        <w:t>2026-08-10 migration note:</w:t>
+      </w:r>
+      <w:r>
+        <w:t xml:space="preserve"> restated against the exactly-three-subquestion structure of Chapter 3 §3.3; see </w:t>
+      </w:r>
+      <w:r>
+        <w:rPr>
+          <w:rFonts w:ascii="Consolas" w:hAnsi="Consolas"/>
+          <w:color w:val="1F4D78"/>
+          <w:sz w:val="18"/>
+        </w:rPr>
+        <w:t>docs/research/phd-proposal/legacy-rq-crosswalk.md</w:t>
+      </w:r>
+      <w:r>
+        <w:t xml:space="preserve"> §3 for how the prior five-sub-question draft maps onto SQ1-SQ3. This wording remains provisional pending </w:t>
+      </w:r>
+      <w:r>
+        <w:rPr>
+          <w:rFonts w:ascii="Consolas" w:hAnsi="Consolas"/>
+          <w:color w:val="1F4D78"/>
+          <w:sz w:val="18"/>
+        </w:rPr>
+        <w:t>D-RQ-01</w:t>
+      </w:r>
+      <w:r>
+        <w:t>/</w:t>
+      </w:r>
+      <w:r>
+        <w:rPr>
+          <w:rFonts w:ascii="Consolas" w:hAnsi="Consolas"/>
+          <w:color w:val="1F4D78"/>
+          <w:sz w:val="18"/>
+        </w:rPr>
+        <w:t>D-RQ-02</w:t>
+      </w:r>
+      <w:r>
+        <w:t xml:space="preserve"> supervisor sign-off.</w:t>
       </w:r>
     </w:p>
     <w:p>
@@ -24161,7 +24371,18 @@
         <w:rPr>
           <w:b/>
         </w:rPr>
-        <w:t>SQ1 (Control and timing):</w:t>
+        <w:t>U-RQ.</w:t>
+      </w:r>
+      <w:r>
+        <w:t xml:space="preserve"> The research question asked how human judgment can be captured, governed, and used to support agentic-AI-driven variability exploration in guideline operationalization scenarios, enabling reliable human-AI co-reasoning. The thesis answered this by surveying six areas of related work, identifying the gaps summarized below, and demonstrating a concrete artifact that closes them.</w:t>
+      </w:r>
+    </w:p>
+    <w:p>
+      <w:r>
+        <w:rPr>
+          <w:b/>
+        </w:rPr>
+        <w:t>SQ1 (Selective intervention):</w:t>
       </w:r>
       <w:r>
         <w:t xml:space="preserve"> the artifact positions itself between on-the-loop and co-reasoning, escalating by exception while making the human's rationale durable and retrievable.</w:t>
@@ -24172,10 +24393,10 @@
         <w:rPr>
           <w:b/>
         </w:rPr>
-        <w:t>SQ2 (Information direction):</w:t>
-      </w:r>
-      <w:r>
-        <w:t xml:space="preserve"> information flows bidirectionally  -  the AI's evidence informs the human's review, and the human's structured decision feeds forward through memory and advisory retrieval.</w:t>
+        <w:t>SQ2 (Governed knowledge reuse):</w:t>
+      </w:r>
+      <w:r>
+        <w:t xml:space="preserve"> information flows bidirectionally  -  the AI's evidence informs the human's review, and the human's structured decision feeds forward through memory and advisory retrieval. Human judgment is treated as a reusable asset, not a transient correction: the judgment memory stores it with provenance and retrieves it for similar future cases. The running example (§4.4-§7.3) illustrates this concretely: a single expert judgment about "Customer as actor" is captured, stored, retrieved as advisory evidence, and used in a controlled comparison  -  demonstrating the full lifecycle. The combination of schema-validated feedback, provenance-tracked memory, and explainable retrieval is novel in the model-assessment context.</w:t>
       </w:r>
     </w:p>
     <w:p>
@@ -24183,10 +24404,10 @@
         <w:rPr>
           <w:b/>
         </w:rPr>
-        <w:t>SQ3 (Role of judgment):</w:t>
-      </w:r>
-      <w:r>
-        <w:t xml:space="preserve"> human judgment is treated as a reusable asset, not a transient correction. The judgment memory stores it with provenance and retrieves it for similar future cases. The running example (§4.4-§7.3) illustrates this concretely: a single expert judgment about "Customer as actor" is captured, stored, retrieved as advisory evidence, and used in a controlled comparison  -  demonstrating the full lifecycle.</w:t>
+        <w:t>SQ3 (Evaluation and transfer):</w:t>
+      </w:r>
+      <w:r>
+        <w:t xml:space="preserve"> the deterministic parallel comparison mechanism (M4B-1) makes reuse measurable without changing the original result, which is what a transfer claim requires; whether reuse in fact transfers safely across settings and  -  when governance and access permit  -  across domains is the open empirical question carried into Chapter 6's evidence gates, not a result claimed here.</w:t>
       </w:r>
     </w:p>
     <w:p>
@@ -24194,21 +24415,10 @@
         <w:rPr>
           <w:b/>
         </w:rPr>
-        <w:t>SQ4 (Structure and reuse):</w:t>
-      </w:r>
-      <w:r>
-        <w:t xml:space="preserve"> the combination of schema-validated feedback, provenance-tracked memory, explainable retrieval, and deterministic parallel comparison is novel in the model-assessment context.</w:t>
-      </w:r>
-    </w:p>
-    <w:p>
-      <w:r>
-        <w:rPr>
-          <w:b/>
-        </w:rPr>
-        <w:t>SQ5 (The MDE-assessment gap):</w:t>
-      </w:r>
-      <w:r>
-        <w:t xml:space="preserve"> the thesis contributes the missing human-judgment lifecycle for variability interpretation, extending VEGO-AI's substantial/occasional distinction with reusable expert knowledge.</w:t>
+        <w:t>Positioning (was SQ5, the MDE-assessment gap):</w:t>
+      </w:r>
+      <w:r>
+        <w:t xml:space="preserve"> the thesis contributes the missing human-judgment lifecycle for variability interpretation, extending VEGO-AI's substantial/occasional distinction with reusable expert knowledge. Retained as literature positioning rather than a numbered sub-question, per the crosswalk.</w:t>
       </w:r>
     </w:p>
     <w:p>
@@ -32352,7 +32562,7 @@
         <w:color w:val="596573"/>
         <w:sz w:val="17"/>
       </w:rPr>
-      <w:t xml:space="preserve">   |   source 2e0d014b</w:t>
+      <w:t xml:space="preserve">   |   source aba24508</w:t>
     </w:r>
   </w:p>
 </w:hdr>

</xml_diff>